<commit_message>
Deal summary with no canceled ones
</commit_message>
<xml_diff>
--- a/docs/gost/out/03_П3_Описание_автоматизированных_функций.docx
+++ b/docs/gost/out/03_П3_Описание_автоматизированных_функций.docx
@@ -306,7 +306,7 @@
       <w:r>
         <w:fldChar w:fldCharType="separate"/>
       </w:r>
-      <w:hyperlink w:anchor="_Toc243987276" w:history="1">
+      <w:hyperlink w:anchor="_Toc243990004" w:history="1">
         <w:r>
           <w:rPr>
             <w:rStyle w:val="aff8"/>
@@ -333,7 +333,7 @@
             <w:noProof/>
             <w:webHidden/>
           </w:rPr>
-          <w:instrText xml:space="preserve"> PAGEREF _Toc243987276 \h </w:instrText>
+          <w:instrText xml:space="preserve"> PAGEREF _Toc243990004 \h </w:instrText>
         </w:r>
         <w:r>
           <w:rPr>
@@ -379,7 +379,7 @@
           <w14:ligatures w14:val="standardContextual"/>
         </w:rPr>
       </w:pPr>
-      <w:hyperlink w:anchor="_Toc243987277" w:history="1">
+      <w:hyperlink w:anchor="_Toc243990005" w:history="1">
         <w:r>
           <w:rPr>
             <w:rStyle w:val="aff8"/>
@@ -406,7 +406,7 @@
             <w:noProof/>
             <w:webHidden/>
           </w:rPr>
-          <w:instrText xml:space="preserve"> PAGEREF _Toc243987277 \h </w:instrText>
+          <w:instrText xml:space="preserve"> PAGEREF _Toc243990005 \h </w:instrText>
         </w:r>
         <w:r>
           <w:rPr>
@@ -452,7 +452,7 @@
           <w14:ligatures w14:val="standardContextual"/>
         </w:rPr>
       </w:pPr>
-      <w:hyperlink w:anchor="_Toc243987278" w:history="1">
+      <w:hyperlink w:anchor="_Toc243990006" w:history="1">
         <w:r>
           <w:rPr>
             <w:rStyle w:val="aff8"/>
@@ -479,7 +479,7 @@
             <w:noProof/>
             <w:webHidden/>
           </w:rPr>
-          <w:instrText xml:space="preserve"> PAGEREF _Toc243987278 \h </w:instrText>
+          <w:instrText xml:space="preserve"> PAGEREF _Toc243990006 \h </w:instrText>
         </w:r>
         <w:r>
           <w:rPr>
@@ -525,7 +525,7 @@
           <w14:ligatures w14:val="standardContextual"/>
         </w:rPr>
       </w:pPr>
-      <w:hyperlink w:anchor="_Toc243987279" w:history="1">
+      <w:hyperlink w:anchor="_Toc243990007" w:history="1">
         <w:r>
           <w:rPr>
             <w:rStyle w:val="aff8"/>
@@ -552,7 +552,7 @@
             <w:noProof/>
             <w:webHidden/>
           </w:rPr>
-          <w:instrText xml:space="preserve"> PAGEREF _Toc243987279 \h </w:instrText>
+          <w:instrText xml:space="preserve"> PAGEREF _Toc243990007 \h </w:instrText>
         </w:r>
         <w:r>
           <w:rPr>
@@ -598,7 +598,7 @@
           <w14:ligatures w14:val="standardContextual"/>
         </w:rPr>
       </w:pPr>
-      <w:hyperlink w:anchor="_Toc243987280" w:history="1">
+      <w:hyperlink w:anchor="_Toc243990008" w:history="1">
         <w:r>
           <w:rPr>
             <w:rStyle w:val="aff8"/>
@@ -625,7 +625,7 @@
             <w:noProof/>
             <w:webHidden/>
           </w:rPr>
-          <w:instrText xml:space="preserve"> PAGEREF _Toc243987280 \h </w:instrText>
+          <w:instrText xml:space="preserve"> PAGEREF _Toc243990008 \h </w:instrText>
         </w:r>
         <w:r>
           <w:rPr>
@@ -671,7 +671,7 @@
           <w14:ligatures w14:val="standardContextual"/>
         </w:rPr>
       </w:pPr>
-      <w:hyperlink w:anchor="_Toc243987281" w:history="1">
+      <w:hyperlink w:anchor="_Toc243990009" w:history="1">
         <w:r>
           <w:rPr>
             <w:rStyle w:val="aff8"/>
@@ -698,7 +698,7 @@
             <w:noProof/>
             <w:webHidden/>
           </w:rPr>
-          <w:instrText xml:space="preserve"> PAGEREF _Toc243987281 \h </w:instrText>
+          <w:instrText xml:space="preserve"> PAGEREF _Toc243990009 \h </w:instrText>
         </w:r>
         <w:r>
           <w:rPr>
@@ -744,7 +744,7 @@
           <w14:ligatures w14:val="standardContextual"/>
         </w:rPr>
       </w:pPr>
-      <w:hyperlink w:anchor="_Toc243987282" w:history="1">
+      <w:hyperlink w:anchor="_Toc243990010" w:history="1">
         <w:r>
           <w:rPr>
             <w:rStyle w:val="aff8"/>
@@ -771,7 +771,7 @@
             <w:noProof/>
             <w:webHidden/>
           </w:rPr>
-          <w:instrText xml:space="preserve"> PAGEREF _Toc243987282 \h </w:instrText>
+          <w:instrText xml:space="preserve"> PAGEREF _Toc243990010 \h </w:instrText>
         </w:r>
         <w:r>
           <w:rPr>
@@ -817,7 +817,7 @@
           <w14:ligatures w14:val="standardContextual"/>
         </w:rPr>
       </w:pPr>
-      <w:hyperlink w:anchor="_Toc243987283" w:history="1">
+      <w:hyperlink w:anchor="_Toc243990011" w:history="1">
         <w:r>
           <w:rPr>
             <w:rStyle w:val="aff8"/>
@@ -844,7 +844,7 @@
             <w:noProof/>
             <w:webHidden/>
           </w:rPr>
-          <w:instrText xml:space="preserve"> PAGEREF _Toc243987283 \h </w:instrText>
+          <w:instrText xml:space="preserve"> PAGEREF _Toc243990011 \h </w:instrText>
         </w:r>
         <w:r>
           <w:rPr>
@@ -890,7 +890,7 @@
           <w14:ligatures w14:val="standardContextual"/>
         </w:rPr>
       </w:pPr>
-      <w:hyperlink w:anchor="_Toc243987284" w:history="1">
+      <w:hyperlink w:anchor="_Toc243990012" w:history="1">
         <w:r>
           <w:rPr>
             <w:rStyle w:val="aff8"/>
@@ -917,7 +917,7 @@
             <w:noProof/>
             <w:webHidden/>
           </w:rPr>
-          <w:instrText xml:space="preserve"> PAGEREF _Toc243987284 \h </w:instrText>
+          <w:instrText xml:space="preserve"> PAGEREF _Toc243990012 \h </w:instrText>
         </w:r>
         <w:r>
           <w:rPr>
@@ -963,7 +963,7 @@
           <w14:ligatures w14:val="standardContextual"/>
         </w:rPr>
       </w:pPr>
-      <w:hyperlink w:anchor="_Toc243987285" w:history="1">
+      <w:hyperlink w:anchor="_Toc243990013" w:history="1">
         <w:r>
           <w:rPr>
             <w:rStyle w:val="aff8"/>
@@ -990,7 +990,7 @@
             <w:noProof/>
             <w:webHidden/>
           </w:rPr>
-          <w:instrText xml:space="preserve"> PAGEREF _Toc243987285 \h </w:instrText>
+          <w:instrText xml:space="preserve"> PAGEREF _Toc243990013 \h </w:instrText>
         </w:r>
         <w:r>
           <w:rPr>
@@ -1036,7 +1036,7 @@
           <w14:ligatures w14:val="standardContextual"/>
         </w:rPr>
       </w:pPr>
-      <w:hyperlink w:anchor="_Toc243987286" w:history="1">
+      <w:hyperlink w:anchor="_Toc243990014" w:history="1">
         <w:r>
           <w:rPr>
             <w:rStyle w:val="aff8"/>
@@ -1063,7 +1063,7 @@
             <w:noProof/>
             <w:webHidden/>
           </w:rPr>
-          <w:instrText xml:space="preserve"> PAGEREF _Toc243987286 \h </w:instrText>
+          <w:instrText xml:space="preserve"> PAGEREF _Toc243990014 \h </w:instrText>
         </w:r>
         <w:r>
           <w:rPr>
@@ -1109,7 +1109,7 @@
           <w14:ligatures w14:val="standardContextual"/>
         </w:rPr>
       </w:pPr>
-      <w:hyperlink w:anchor="_Toc243987287" w:history="1">
+      <w:hyperlink w:anchor="_Toc243990015" w:history="1">
         <w:r>
           <w:rPr>
             <w:rStyle w:val="aff8"/>
@@ -1136,7 +1136,7 @@
             <w:noProof/>
             <w:webHidden/>
           </w:rPr>
-          <w:instrText xml:space="preserve"> PAGEREF _Toc243987287 \h </w:instrText>
+          <w:instrText xml:space="preserve"> PAGEREF _Toc243990015 \h </w:instrText>
         </w:r>
         <w:r>
           <w:rPr>
@@ -1182,7 +1182,7 @@
           <w14:ligatures w14:val="standardContextual"/>
         </w:rPr>
       </w:pPr>
-      <w:hyperlink w:anchor="_Toc243987288" w:history="1">
+      <w:hyperlink w:anchor="_Toc243990016" w:history="1">
         <w:r>
           <w:rPr>
             <w:rStyle w:val="aff8"/>
@@ -1209,7 +1209,7 @@
             <w:noProof/>
             <w:webHidden/>
           </w:rPr>
-          <w:instrText xml:space="preserve"> PAGEREF _Toc243987288 \h </w:instrText>
+          <w:instrText xml:space="preserve"> PAGEREF _Toc243990016 \h </w:instrText>
         </w:r>
         <w:r>
           <w:rPr>
@@ -1255,7 +1255,7 @@
           <w14:ligatures w14:val="standardContextual"/>
         </w:rPr>
       </w:pPr>
-      <w:hyperlink w:anchor="_Toc243987289" w:history="1">
+      <w:hyperlink w:anchor="_Toc243990017" w:history="1">
         <w:r>
           <w:rPr>
             <w:rStyle w:val="aff8"/>
@@ -1282,7 +1282,7 @@
             <w:noProof/>
             <w:webHidden/>
           </w:rPr>
-          <w:instrText xml:space="preserve"> PAGEREF _Toc243987289 \h </w:instrText>
+          <w:instrText xml:space="preserve"> PAGEREF _Toc243990017 \h </w:instrText>
         </w:r>
         <w:r>
           <w:rPr>
@@ -1328,7 +1328,7 @@
           <w14:ligatures w14:val="standardContextual"/>
         </w:rPr>
       </w:pPr>
-      <w:hyperlink w:anchor="_Toc243987290" w:history="1">
+      <w:hyperlink w:anchor="_Toc243990018" w:history="1">
         <w:r>
           <w:rPr>
             <w:rStyle w:val="aff8"/>
@@ -1355,7 +1355,7 @@
             <w:noProof/>
             <w:webHidden/>
           </w:rPr>
-          <w:instrText xml:space="preserve"> PAGEREF _Toc243987290 \h </w:instrText>
+          <w:instrText xml:space="preserve"> PAGEREF _Toc243990018 \h </w:instrText>
         </w:r>
         <w:r>
           <w:rPr>
@@ -1401,7 +1401,7 @@
           <w14:ligatures w14:val="standardContextual"/>
         </w:rPr>
       </w:pPr>
-      <w:hyperlink w:anchor="_Toc243987291" w:history="1">
+      <w:hyperlink w:anchor="_Toc243990019" w:history="1">
         <w:r>
           <w:rPr>
             <w:rStyle w:val="aff8"/>
@@ -1428,7 +1428,7 @@
             <w:noProof/>
             <w:webHidden/>
           </w:rPr>
-          <w:instrText xml:space="preserve"> PAGEREF _Toc243987291 \h </w:instrText>
+          <w:instrText xml:space="preserve"> PAGEREF _Toc243990019 \h </w:instrText>
         </w:r>
         <w:r>
           <w:rPr>
@@ -1474,7 +1474,7 @@
           <w14:ligatures w14:val="standardContextual"/>
         </w:rPr>
       </w:pPr>
-      <w:hyperlink w:anchor="_Toc243987292" w:history="1">
+      <w:hyperlink w:anchor="_Toc243990020" w:history="1">
         <w:r>
           <w:rPr>
             <w:rStyle w:val="aff8"/>
@@ -1501,7 +1501,7 @@
             <w:noProof/>
             <w:webHidden/>
           </w:rPr>
-          <w:instrText xml:space="preserve"> PAGEREF _Toc243987292 \h </w:instrText>
+          <w:instrText xml:space="preserve"> PAGEREF _Toc243990020 \h </w:instrText>
         </w:r>
         <w:r>
           <w:rPr>
@@ -1547,7 +1547,7 @@
           <w14:ligatures w14:val="standardContextual"/>
         </w:rPr>
       </w:pPr>
-      <w:hyperlink w:anchor="_Toc243987293" w:history="1">
+      <w:hyperlink w:anchor="_Toc243990021" w:history="1">
         <w:r>
           <w:rPr>
             <w:rStyle w:val="aff8"/>
@@ -1574,7 +1574,7 @@
             <w:noProof/>
             <w:webHidden/>
           </w:rPr>
-          <w:instrText xml:space="preserve"> PAGEREF _Toc243987293 \h </w:instrText>
+          <w:instrText xml:space="preserve"> PAGEREF _Toc243990021 \h </w:instrText>
         </w:r>
         <w:r>
           <w:rPr>
@@ -1620,7 +1620,7 @@
           <w14:ligatures w14:val="standardContextual"/>
         </w:rPr>
       </w:pPr>
-      <w:hyperlink w:anchor="_Toc243987294" w:history="1">
+      <w:hyperlink w:anchor="_Toc243990022" w:history="1">
         <w:r>
           <w:rPr>
             <w:rStyle w:val="aff8"/>
@@ -1647,7 +1647,7 @@
             <w:noProof/>
             <w:webHidden/>
           </w:rPr>
-          <w:instrText xml:space="preserve"> PAGEREF _Toc243987294 \h </w:instrText>
+          <w:instrText xml:space="preserve"> PAGEREF _Toc243990022 \h </w:instrText>
         </w:r>
         <w:r>
           <w:rPr>
@@ -1693,7 +1693,7 @@
           <w14:ligatures w14:val="standardContextual"/>
         </w:rPr>
       </w:pPr>
-      <w:hyperlink w:anchor="_Toc243987295" w:history="1">
+      <w:hyperlink w:anchor="_Toc243990023" w:history="1">
         <w:r>
           <w:rPr>
             <w:rStyle w:val="aff8"/>
@@ -1720,7 +1720,7 @@
             <w:noProof/>
             <w:webHidden/>
           </w:rPr>
-          <w:instrText xml:space="preserve"> PAGEREF _Toc243987295 \h </w:instrText>
+          <w:instrText xml:space="preserve"> PAGEREF _Toc243990023 \h </w:instrText>
         </w:r>
         <w:r>
           <w:rPr>
@@ -1766,7 +1766,7 @@
           <w14:ligatures w14:val="standardContextual"/>
         </w:rPr>
       </w:pPr>
-      <w:hyperlink w:anchor="_Toc243987296" w:history="1">
+      <w:hyperlink w:anchor="_Toc243990024" w:history="1">
         <w:r>
           <w:rPr>
             <w:rStyle w:val="aff8"/>
@@ -1793,7 +1793,7 @@
             <w:noProof/>
             <w:webHidden/>
           </w:rPr>
-          <w:instrText xml:space="preserve"> PAGEREF _Toc243987296 \h </w:instrText>
+          <w:instrText xml:space="preserve"> PAGEREF _Toc243990024 \h </w:instrText>
         </w:r>
         <w:r>
           <w:rPr>
@@ -1839,7 +1839,7 @@
           <w14:ligatures w14:val="standardContextual"/>
         </w:rPr>
       </w:pPr>
-      <w:hyperlink w:anchor="_Toc243987297" w:history="1">
+      <w:hyperlink w:anchor="_Toc243990025" w:history="1">
         <w:r>
           <w:rPr>
             <w:rStyle w:val="aff8"/>
@@ -1866,7 +1866,7 @@
             <w:noProof/>
             <w:webHidden/>
           </w:rPr>
-          <w:instrText xml:space="preserve"> PAGEREF _Toc243987297 \h </w:instrText>
+          <w:instrText xml:space="preserve"> PAGEREF _Toc243990025 \h </w:instrText>
         </w:r>
         <w:r>
           <w:rPr>
@@ -1912,7 +1912,7 @@
           <w14:ligatures w14:val="standardContextual"/>
         </w:rPr>
       </w:pPr>
-      <w:hyperlink w:anchor="_Toc243987298" w:history="1">
+      <w:hyperlink w:anchor="_Toc243990026" w:history="1">
         <w:r>
           <w:rPr>
             <w:rStyle w:val="aff8"/>
@@ -1939,7 +1939,7 @@
             <w:noProof/>
             <w:webHidden/>
           </w:rPr>
-          <w:instrText xml:space="preserve"> PAGEREF _Toc243987298 \h </w:instrText>
+          <w:instrText xml:space="preserve"> PAGEREF _Toc243990026 \h </w:instrText>
         </w:r>
         <w:r>
           <w:rPr>
@@ -1985,7 +1985,7 @@
           <w14:ligatures w14:val="standardContextual"/>
         </w:rPr>
       </w:pPr>
-      <w:hyperlink w:anchor="_Toc243987299" w:history="1">
+      <w:hyperlink w:anchor="_Toc243990027" w:history="1">
         <w:r>
           <w:rPr>
             <w:rStyle w:val="aff8"/>
@@ -2012,7 +2012,7 @@
             <w:noProof/>
             <w:webHidden/>
           </w:rPr>
-          <w:instrText xml:space="preserve"> PAGEREF _Toc243987299 \h </w:instrText>
+          <w:instrText xml:space="preserve"> PAGEREF _Toc243990027 \h </w:instrText>
         </w:r>
         <w:r>
           <w:rPr>
@@ -2058,7 +2058,7 @@
           <w14:ligatures w14:val="standardContextual"/>
         </w:rPr>
       </w:pPr>
-      <w:hyperlink w:anchor="_Toc243987300" w:history="1">
+      <w:hyperlink w:anchor="_Toc243990028" w:history="1">
         <w:r>
           <w:rPr>
             <w:rStyle w:val="aff8"/>
@@ -2085,7 +2085,7 @@
             <w:noProof/>
             <w:webHidden/>
           </w:rPr>
-          <w:instrText xml:space="preserve"> PAGEREF _Toc243987300 \h </w:instrText>
+          <w:instrText xml:space="preserve"> PAGEREF _Toc243990028 \h </w:instrText>
         </w:r>
         <w:r>
           <w:rPr>
@@ -2131,7 +2131,7 @@
           <w14:ligatures w14:val="standardContextual"/>
         </w:rPr>
       </w:pPr>
-      <w:hyperlink w:anchor="_Toc243987301" w:history="1">
+      <w:hyperlink w:anchor="_Toc243990029" w:history="1">
         <w:r>
           <w:rPr>
             <w:rStyle w:val="aff8"/>
@@ -2158,7 +2158,7 @@
             <w:noProof/>
             <w:webHidden/>
           </w:rPr>
-          <w:instrText xml:space="preserve"> PAGEREF _Toc243987301 \h </w:instrText>
+          <w:instrText xml:space="preserve"> PAGEREF _Toc243990029 \h </w:instrText>
         </w:r>
         <w:r>
           <w:rPr>
@@ -2204,7 +2204,7 @@
           <w14:ligatures w14:val="standardContextual"/>
         </w:rPr>
       </w:pPr>
-      <w:hyperlink w:anchor="_Toc243987302" w:history="1">
+      <w:hyperlink w:anchor="_Toc243990030" w:history="1">
         <w:r>
           <w:rPr>
             <w:rStyle w:val="aff8"/>
@@ -2231,7 +2231,7 @@
             <w:noProof/>
             <w:webHidden/>
           </w:rPr>
-          <w:instrText xml:space="preserve"> PAGEREF _Toc243987302 \h </w:instrText>
+          <w:instrText xml:space="preserve"> PAGEREF _Toc243990030 \h </w:instrText>
         </w:r>
         <w:r>
           <w:rPr>
@@ -2277,7 +2277,7 @@
           <w14:ligatures w14:val="standardContextual"/>
         </w:rPr>
       </w:pPr>
-      <w:hyperlink w:anchor="_Toc243987303" w:history="1">
+      <w:hyperlink w:anchor="_Toc243990031" w:history="1">
         <w:r>
           <w:rPr>
             <w:rStyle w:val="aff8"/>
@@ -2304,7 +2304,7 @@
             <w:noProof/>
             <w:webHidden/>
           </w:rPr>
-          <w:instrText xml:space="preserve"> PAGEREF _Toc243987303 \h </w:instrText>
+          <w:instrText xml:space="preserve"> PAGEREF _Toc243990031 \h </w:instrText>
         </w:r>
         <w:r>
           <w:rPr>
@@ -2350,7 +2350,7 @@
           <w14:ligatures w14:val="standardContextual"/>
         </w:rPr>
       </w:pPr>
-      <w:hyperlink w:anchor="_Toc243987304" w:history="1">
+      <w:hyperlink w:anchor="_Toc243990032" w:history="1">
         <w:r>
           <w:rPr>
             <w:rStyle w:val="aff8"/>
@@ -2377,7 +2377,7 @@
             <w:noProof/>
             <w:webHidden/>
           </w:rPr>
-          <w:instrText xml:space="preserve"> PAGEREF _Toc243987304 \h </w:instrText>
+          <w:instrText xml:space="preserve"> PAGEREF _Toc243990032 \h </w:instrText>
         </w:r>
         <w:r>
           <w:rPr>
@@ -2423,7 +2423,7 @@
           <w14:ligatures w14:val="standardContextual"/>
         </w:rPr>
       </w:pPr>
-      <w:hyperlink w:anchor="_Toc243987305" w:history="1">
+      <w:hyperlink w:anchor="_Toc243990033" w:history="1">
         <w:r>
           <w:rPr>
             <w:rStyle w:val="aff8"/>
@@ -2450,7 +2450,7 @@
             <w:noProof/>
             <w:webHidden/>
           </w:rPr>
-          <w:instrText xml:space="preserve"> PAGEREF _Toc243987305 \h </w:instrText>
+          <w:instrText xml:space="preserve"> PAGEREF _Toc243990033 \h </w:instrText>
         </w:r>
         <w:r>
           <w:rPr>
@@ -2496,7 +2496,7 @@
           <w14:ligatures w14:val="standardContextual"/>
         </w:rPr>
       </w:pPr>
-      <w:hyperlink w:anchor="_Toc243987306" w:history="1">
+      <w:hyperlink w:anchor="_Toc243990034" w:history="1">
         <w:r>
           <w:rPr>
             <w:rStyle w:val="aff8"/>
@@ -2523,7 +2523,7 @@
             <w:noProof/>
             <w:webHidden/>
           </w:rPr>
-          <w:instrText xml:space="preserve"> PAGEREF _Toc243987306 \h </w:instrText>
+          <w:instrText xml:space="preserve"> PAGEREF _Toc243990034 \h </w:instrText>
         </w:r>
         <w:r>
           <w:rPr>
@@ -2569,7 +2569,7 @@
           <w14:ligatures w14:val="standardContextual"/>
         </w:rPr>
       </w:pPr>
-      <w:hyperlink w:anchor="_Toc243987307" w:history="1">
+      <w:hyperlink w:anchor="_Toc243990035" w:history="1">
         <w:r>
           <w:rPr>
             <w:rStyle w:val="aff8"/>
@@ -2596,7 +2596,7 @@
             <w:noProof/>
             <w:webHidden/>
           </w:rPr>
-          <w:instrText xml:space="preserve"> PAGEREF _Toc243987307 \h </w:instrText>
+          <w:instrText xml:space="preserve"> PAGEREF _Toc243990035 \h </w:instrText>
         </w:r>
         <w:r>
           <w:rPr>
@@ -2642,7 +2642,7 @@
           <w14:ligatures w14:val="standardContextual"/>
         </w:rPr>
       </w:pPr>
-      <w:hyperlink w:anchor="_Toc243987308" w:history="1">
+      <w:hyperlink w:anchor="_Toc243990036" w:history="1">
         <w:r>
           <w:rPr>
             <w:rStyle w:val="aff8"/>
@@ -2669,7 +2669,7 @@
             <w:noProof/>
             <w:webHidden/>
           </w:rPr>
-          <w:instrText xml:space="preserve"> PAGEREF _Toc243987308 \h </w:instrText>
+          <w:instrText xml:space="preserve"> PAGEREF _Toc243990036 \h </w:instrText>
         </w:r>
         <w:r>
           <w:rPr>
@@ -2715,7 +2715,7 @@
           <w14:ligatures w14:val="standardContextual"/>
         </w:rPr>
       </w:pPr>
-      <w:hyperlink w:anchor="_Toc243987309" w:history="1">
+      <w:hyperlink w:anchor="_Toc243990037" w:history="1">
         <w:r>
           <w:rPr>
             <w:rStyle w:val="aff8"/>
@@ -2742,7 +2742,7 @@
             <w:noProof/>
             <w:webHidden/>
           </w:rPr>
-          <w:instrText xml:space="preserve"> PAGEREF _Toc243987309 \h </w:instrText>
+          <w:instrText xml:space="preserve"> PAGEREF _Toc243990037 \h </w:instrText>
         </w:r>
         <w:r>
           <w:rPr>
@@ -2788,7 +2788,7 @@
           <w14:ligatures w14:val="standardContextual"/>
         </w:rPr>
       </w:pPr>
-      <w:hyperlink w:anchor="_Toc243987310" w:history="1">
+      <w:hyperlink w:anchor="_Toc243990038" w:history="1">
         <w:r>
           <w:rPr>
             <w:rStyle w:val="aff8"/>
@@ -2815,7 +2815,7 @@
             <w:noProof/>
             <w:webHidden/>
           </w:rPr>
-          <w:instrText xml:space="preserve"> PAGEREF _Toc243987310 \h </w:instrText>
+          <w:instrText xml:space="preserve"> PAGEREF _Toc243990038 \h </w:instrText>
         </w:r>
         <w:r>
           <w:rPr>
@@ -2861,7 +2861,7 @@
           <w14:ligatures w14:val="standardContextual"/>
         </w:rPr>
       </w:pPr>
-      <w:hyperlink w:anchor="_Toc243987311" w:history="1">
+      <w:hyperlink w:anchor="_Toc243990039" w:history="1">
         <w:r>
           <w:rPr>
             <w:rStyle w:val="aff8"/>
@@ -2888,7 +2888,7 @@
             <w:noProof/>
             <w:webHidden/>
           </w:rPr>
-          <w:instrText xml:space="preserve"> PAGEREF _Toc243987311 \h </w:instrText>
+          <w:instrText xml:space="preserve"> PAGEREF _Toc243990039 \h </w:instrText>
         </w:r>
         <w:r>
           <w:rPr>
@@ -2934,7 +2934,7 @@
           <w14:ligatures w14:val="standardContextual"/>
         </w:rPr>
       </w:pPr>
-      <w:hyperlink w:anchor="_Toc243987312" w:history="1">
+      <w:hyperlink w:anchor="_Toc243990040" w:history="1">
         <w:r>
           <w:rPr>
             <w:rStyle w:val="aff8"/>
@@ -2961,7 +2961,7 @@
             <w:noProof/>
             <w:webHidden/>
           </w:rPr>
-          <w:instrText xml:space="preserve"> PAGEREF _Toc243987312 \h </w:instrText>
+          <w:instrText xml:space="preserve"> PAGEREF _Toc243990040 \h </w:instrText>
         </w:r>
         <w:r>
           <w:rPr>
@@ -3007,7 +3007,7 @@
           <w14:ligatures w14:val="standardContextual"/>
         </w:rPr>
       </w:pPr>
-      <w:hyperlink w:anchor="_Toc243987313" w:history="1">
+      <w:hyperlink w:anchor="_Toc243990041" w:history="1">
         <w:r>
           <w:rPr>
             <w:rStyle w:val="aff8"/>
@@ -3034,7 +3034,7 @@
             <w:noProof/>
             <w:webHidden/>
           </w:rPr>
-          <w:instrText xml:space="preserve"> PAGEREF _Toc243987313 \h </w:instrText>
+          <w:instrText xml:space="preserve"> PAGEREF _Toc243990041 \h </w:instrText>
         </w:r>
         <w:r>
           <w:rPr>
@@ -3080,7 +3080,7 @@
           <w14:ligatures w14:val="standardContextual"/>
         </w:rPr>
       </w:pPr>
-      <w:hyperlink w:anchor="_Toc243987314" w:history="1">
+      <w:hyperlink w:anchor="_Toc243990042" w:history="1">
         <w:r>
           <w:rPr>
             <w:rStyle w:val="aff8"/>
@@ -3107,7 +3107,7 @@
             <w:noProof/>
             <w:webHidden/>
           </w:rPr>
-          <w:instrText xml:space="preserve"> PAGEREF _Toc243987314 \h </w:instrText>
+          <w:instrText xml:space="preserve"> PAGEREF _Toc243990042 \h </w:instrText>
         </w:r>
         <w:r>
           <w:rPr>
@@ -3153,7 +3153,7 @@
           <w14:ligatures w14:val="standardContextual"/>
         </w:rPr>
       </w:pPr>
-      <w:hyperlink w:anchor="_Toc243987315" w:history="1">
+      <w:hyperlink w:anchor="_Toc243990043" w:history="1">
         <w:r>
           <w:rPr>
             <w:rStyle w:val="aff8"/>
@@ -3180,7 +3180,7 @@
             <w:noProof/>
             <w:webHidden/>
           </w:rPr>
-          <w:instrText xml:space="preserve"> PAGEREF _Toc243987315 \h </w:instrText>
+          <w:instrText xml:space="preserve"> PAGEREF _Toc243990043 \h </w:instrText>
         </w:r>
         <w:r>
           <w:rPr>
@@ -3226,7 +3226,7 @@
           <w14:ligatures w14:val="standardContextual"/>
         </w:rPr>
       </w:pPr>
-      <w:hyperlink w:anchor="_Toc243987316" w:history="1">
+      <w:hyperlink w:anchor="_Toc243990044" w:history="1">
         <w:r>
           <w:rPr>
             <w:rStyle w:val="aff8"/>
@@ -3253,7 +3253,7 @@
             <w:noProof/>
             <w:webHidden/>
           </w:rPr>
-          <w:instrText xml:space="preserve"> PAGEREF _Toc243987316 \h </w:instrText>
+          <w:instrText xml:space="preserve"> PAGEREF _Toc243990044 \h </w:instrText>
         </w:r>
         <w:r>
           <w:rPr>
@@ -3299,7 +3299,7 @@
           <w14:ligatures w14:val="standardContextual"/>
         </w:rPr>
       </w:pPr>
-      <w:hyperlink w:anchor="_Toc243987317" w:history="1">
+      <w:hyperlink w:anchor="_Toc243990045" w:history="1">
         <w:r>
           <w:rPr>
             <w:rStyle w:val="aff8"/>
@@ -3326,7 +3326,7 @@
             <w:noProof/>
             <w:webHidden/>
           </w:rPr>
-          <w:instrText xml:space="preserve"> PAGEREF _Toc243987317 \h </w:instrText>
+          <w:instrText xml:space="preserve"> PAGEREF _Toc243990045 \h </w:instrText>
         </w:r>
         <w:r>
           <w:rPr>
@@ -3372,7 +3372,7 @@
           <w14:ligatures w14:val="standardContextual"/>
         </w:rPr>
       </w:pPr>
-      <w:hyperlink w:anchor="_Toc243987318" w:history="1">
+      <w:hyperlink w:anchor="_Toc243990046" w:history="1">
         <w:r>
           <w:rPr>
             <w:rStyle w:val="aff8"/>
@@ -3399,7 +3399,7 @@
             <w:noProof/>
             <w:webHidden/>
           </w:rPr>
-          <w:instrText xml:space="preserve"> PAGEREF _Toc243987318 \h </w:instrText>
+          <w:instrText xml:space="preserve"> PAGEREF _Toc243990046 \h </w:instrText>
         </w:r>
         <w:r>
           <w:rPr>
@@ -3445,7 +3445,7 @@
           <w14:ligatures w14:val="standardContextual"/>
         </w:rPr>
       </w:pPr>
-      <w:hyperlink w:anchor="_Toc243987319" w:history="1">
+      <w:hyperlink w:anchor="_Toc243990047" w:history="1">
         <w:r>
           <w:rPr>
             <w:rStyle w:val="aff8"/>
@@ -3472,7 +3472,7 @@
             <w:noProof/>
             <w:webHidden/>
           </w:rPr>
-          <w:instrText xml:space="preserve"> PAGEREF _Toc243987319 \h </w:instrText>
+          <w:instrText xml:space="preserve"> PAGEREF _Toc243990047 \h </w:instrText>
         </w:r>
         <w:r>
           <w:rPr>
@@ -3518,7 +3518,7 @@
           <w14:ligatures w14:val="standardContextual"/>
         </w:rPr>
       </w:pPr>
-      <w:hyperlink w:anchor="_Toc243987320" w:history="1">
+      <w:hyperlink w:anchor="_Toc243990048" w:history="1">
         <w:r>
           <w:rPr>
             <w:rStyle w:val="aff8"/>
@@ -3545,7 +3545,7 @@
             <w:noProof/>
             <w:webHidden/>
           </w:rPr>
-          <w:instrText xml:space="preserve"> PAGEREF _Toc243987320 \h </w:instrText>
+          <w:instrText xml:space="preserve"> PAGEREF _Toc243990048 \h </w:instrText>
         </w:r>
         <w:r>
           <w:rPr>
@@ -3591,7 +3591,7 @@
           <w14:ligatures w14:val="standardContextual"/>
         </w:rPr>
       </w:pPr>
-      <w:hyperlink w:anchor="_Toc243987321" w:history="1">
+      <w:hyperlink w:anchor="_Toc243990049" w:history="1">
         <w:r>
           <w:rPr>
             <w:rStyle w:val="aff8"/>
@@ -3618,7 +3618,7 @@
             <w:noProof/>
             <w:webHidden/>
           </w:rPr>
-          <w:instrText xml:space="preserve"> PAGEREF _Toc243987321 \h </w:instrText>
+          <w:instrText xml:space="preserve"> PAGEREF _Toc243990049 \h </w:instrText>
         </w:r>
         <w:r>
           <w:rPr>
@@ -3664,7 +3664,7 @@
           <w14:ligatures w14:val="standardContextual"/>
         </w:rPr>
       </w:pPr>
-      <w:hyperlink w:anchor="_Toc243987322" w:history="1">
+      <w:hyperlink w:anchor="_Toc243990050" w:history="1">
         <w:r>
           <w:rPr>
             <w:rStyle w:val="aff8"/>
@@ -3691,7 +3691,7 @@
             <w:noProof/>
             <w:webHidden/>
           </w:rPr>
-          <w:instrText xml:space="preserve"> PAGEREF _Toc243987322 \h </w:instrText>
+          <w:instrText xml:space="preserve"> PAGEREF _Toc243990050 \h </w:instrText>
         </w:r>
         <w:r>
           <w:rPr>
@@ -3737,7 +3737,7 @@
           <w14:ligatures w14:val="standardContextual"/>
         </w:rPr>
       </w:pPr>
-      <w:hyperlink w:anchor="_Toc243987323" w:history="1">
+      <w:hyperlink w:anchor="_Toc243990051" w:history="1">
         <w:r>
           <w:rPr>
             <w:rStyle w:val="aff8"/>
@@ -3764,7 +3764,7 @@
             <w:noProof/>
             <w:webHidden/>
           </w:rPr>
-          <w:instrText xml:space="preserve"> PAGEREF _Toc243987323 \h </w:instrText>
+          <w:instrText xml:space="preserve"> PAGEREF _Toc243990051 \h </w:instrText>
         </w:r>
         <w:r>
           <w:rPr>
@@ -3810,7 +3810,7 @@
           <w14:ligatures w14:val="standardContextual"/>
         </w:rPr>
       </w:pPr>
-      <w:hyperlink w:anchor="_Toc243987324" w:history="1">
+      <w:hyperlink w:anchor="_Toc243990052" w:history="1">
         <w:r>
           <w:rPr>
             <w:rStyle w:val="aff8"/>
@@ -3837,7 +3837,7 @@
             <w:noProof/>
             <w:webHidden/>
           </w:rPr>
-          <w:instrText xml:space="preserve"> PAGEREF _Toc243987324 \h </w:instrText>
+          <w:instrText xml:space="preserve"> PAGEREF _Toc243990052 \h </w:instrText>
         </w:r>
         <w:r>
           <w:rPr>
@@ -3883,7 +3883,7 @@
           <w14:ligatures w14:val="standardContextual"/>
         </w:rPr>
       </w:pPr>
-      <w:hyperlink w:anchor="_Toc243987325" w:history="1">
+      <w:hyperlink w:anchor="_Toc243990053" w:history="1">
         <w:r>
           <w:rPr>
             <w:rStyle w:val="aff8"/>
@@ -3910,7 +3910,7 @@
             <w:noProof/>
             <w:webHidden/>
           </w:rPr>
-          <w:instrText xml:space="preserve"> PAGEREF _Toc243987325 \h </w:instrText>
+          <w:instrText xml:space="preserve"> PAGEREF _Toc243990053 \h </w:instrText>
         </w:r>
         <w:r>
           <w:rPr>
@@ -3956,7 +3956,7 @@
           <w14:ligatures w14:val="standardContextual"/>
         </w:rPr>
       </w:pPr>
-      <w:hyperlink w:anchor="_Toc243987326" w:history="1">
+      <w:hyperlink w:anchor="_Toc243990054" w:history="1">
         <w:r>
           <w:rPr>
             <w:rStyle w:val="aff8"/>
@@ -3983,7 +3983,7 @@
             <w:noProof/>
             <w:webHidden/>
           </w:rPr>
-          <w:instrText xml:space="preserve"> PAGEREF _Toc243987326 \h </w:instrText>
+          <w:instrText xml:space="preserve"> PAGEREF _Toc243990054 \h </w:instrText>
         </w:r>
         <w:r>
           <w:rPr>
@@ -4029,7 +4029,7 @@
           <w14:ligatures w14:val="standardContextual"/>
         </w:rPr>
       </w:pPr>
-      <w:hyperlink w:anchor="_Toc243987327" w:history="1">
+      <w:hyperlink w:anchor="_Toc243990055" w:history="1">
         <w:r>
           <w:rPr>
             <w:rStyle w:val="aff8"/>
@@ -4056,7 +4056,7 @@
             <w:noProof/>
             <w:webHidden/>
           </w:rPr>
-          <w:instrText xml:space="preserve"> PAGEREF _Toc243987327 \h </w:instrText>
+          <w:instrText xml:space="preserve"> PAGEREF _Toc243990055 \h </w:instrText>
         </w:r>
         <w:r>
           <w:rPr>
@@ -4102,7 +4102,7 @@
           <w14:ligatures w14:val="standardContextual"/>
         </w:rPr>
       </w:pPr>
-      <w:hyperlink w:anchor="_Toc243987328" w:history="1">
+      <w:hyperlink w:anchor="_Toc243990056" w:history="1">
         <w:r>
           <w:rPr>
             <w:rStyle w:val="aff8"/>
@@ -4129,7 +4129,7 @@
             <w:noProof/>
             <w:webHidden/>
           </w:rPr>
-          <w:instrText xml:space="preserve"> PAGEREF _Toc243987328 \h </w:instrText>
+          <w:instrText xml:space="preserve"> PAGEREF _Toc243990056 \h </w:instrText>
         </w:r>
         <w:r>
           <w:rPr>
@@ -4175,7 +4175,7 @@
           <w14:ligatures w14:val="standardContextual"/>
         </w:rPr>
       </w:pPr>
-      <w:hyperlink w:anchor="_Toc243987329" w:history="1">
+      <w:hyperlink w:anchor="_Toc243990057" w:history="1">
         <w:r>
           <w:rPr>
             <w:rStyle w:val="aff8"/>
@@ -4202,7 +4202,7 @@
             <w:noProof/>
             <w:webHidden/>
           </w:rPr>
-          <w:instrText xml:space="preserve"> PAGEREF _Toc243987329 \h </w:instrText>
+          <w:instrText xml:space="preserve"> PAGEREF _Toc243990057 \h </w:instrText>
         </w:r>
         <w:r>
           <w:rPr>
@@ -4248,7 +4248,7 @@
           <w14:ligatures w14:val="standardContextual"/>
         </w:rPr>
       </w:pPr>
-      <w:hyperlink w:anchor="_Toc243987330" w:history="1">
+      <w:hyperlink w:anchor="_Toc243990058" w:history="1">
         <w:r>
           <w:rPr>
             <w:rStyle w:val="aff8"/>
@@ -4275,7 +4275,7 @@
             <w:noProof/>
             <w:webHidden/>
           </w:rPr>
-          <w:instrText xml:space="preserve"> PAGEREF _Toc243987330 \h </w:instrText>
+          <w:instrText xml:space="preserve"> PAGEREF _Toc243990058 \h </w:instrText>
         </w:r>
         <w:r>
           <w:rPr>
@@ -4321,7 +4321,7 @@
           <w14:ligatures w14:val="standardContextual"/>
         </w:rPr>
       </w:pPr>
-      <w:hyperlink w:anchor="_Toc243987331" w:history="1">
+      <w:hyperlink w:anchor="_Toc243990059" w:history="1">
         <w:r>
           <w:rPr>
             <w:rStyle w:val="aff8"/>
@@ -4348,7 +4348,7 @@
             <w:noProof/>
             <w:webHidden/>
           </w:rPr>
-          <w:instrText xml:space="preserve"> PAGEREF _Toc243987331 \h </w:instrText>
+          <w:instrText xml:space="preserve"> PAGEREF _Toc243990059 \h </w:instrText>
         </w:r>
         <w:r>
           <w:rPr>
@@ -4394,7 +4394,7 @@
           <w14:ligatures w14:val="standardContextual"/>
         </w:rPr>
       </w:pPr>
-      <w:hyperlink w:anchor="_Toc243987332" w:history="1">
+      <w:hyperlink w:anchor="_Toc243990060" w:history="1">
         <w:r>
           <w:rPr>
             <w:rStyle w:val="aff8"/>
@@ -4421,7 +4421,7 @@
             <w:noProof/>
             <w:webHidden/>
           </w:rPr>
-          <w:instrText xml:space="preserve"> PAGEREF _Toc243987332 \h </w:instrText>
+          <w:instrText xml:space="preserve"> PAGEREF _Toc243990060 \h </w:instrText>
         </w:r>
         <w:r>
           <w:rPr>
@@ -4467,7 +4467,7 @@
           <w14:ligatures w14:val="standardContextual"/>
         </w:rPr>
       </w:pPr>
-      <w:hyperlink w:anchor="_Toc243987333" w:history="1">
+      <w:hyperlink w:anchor="_Toc243990061" w:history="1">
         <w:r>
           <w:rPr>
             <w:rStyle w:val="aff8"/>
@@ -4494,7 +4494,7 @@
             <w:noProof/>
             <w:webHidden/>
           </w:rPr>
-          <w:instrText xml:space="preserve"> PAGEREF _Toc243987333 \h </w:instrText>
+          <w:instrText xml:space="preserve"> PAGEREF _Toc243990061 \h </w:instrText>
         </w:r>
         <w:r>
           <w:rPr>
@@ -4540,7 +4540,7 @@
           <w14:ligatures w14:val="standardContextual"/>
         </w:rPr>
       </w:pPr>
-      <w:hyperlink w:anchor="_Toc243987334" w:history="1">
+      <w:hyperlink w:anchor="_Toc243990062" w:history="1">
         <w:r>
           <w:rPr>
             <w:rStyle w:val="aff8"/>
@@ -4567,7 +4567,7 @@
             <w:noProof/>
             <w:webHidden/>
           </w:rPr>
-          <w:instrText xml:space="preserve"> PAGEREF _Toc243987334 \h </w:instrText>
+          <w:instrText xml:space="preserve"> PAGEREF _Toc243990062 \h </w:instrText>
         </w:r>
         <w:r>
           <w:rPr>
@@ -4613,7 +4613,7 @@
           <w14:ligatures w14:val="standardContextual"/>
         </w:rPr>
       </w:pPr>
-      <w:hyperlink w:anchor="_Toc243987335" w:history="1">
+      <w:hyperlink w:anchor="_Toc243990063" w:history="1">
         <w:r>
           <w:rPr>
             <w:rStyle w:val="aff8"/>
@@ -4640,7 +4640,7 @@
             <w:noProof/>
             <w:webHidden/>
           </w:rPr>
-          <w:instrText xml:space="preserve"> PAGEREF _Toc243987335 \h </w:instrText>
+          <w:instrText xml:space="preserve"> PAGEREF _Toc243990063 \h </w:instrText>
         </w:r>
         <w:r>
           <w:rPr>
@@ -4686,7 +4686,7 @@
           <w14:ligatures w14:val="standardContextual"/>
         </w:rPr>
       </w:pPr>
-      <w:hyperlink w:anchor="_Toc243987336" w:history="1">
+      <w:hyperlink w:anchor="_Toc243990064" w:history="1">
         <w:r>
           <w:rPr>
             <w:rStyle w:val="aff8"/>
@@ -4713,7 +4713,7 @@
             <w:noProof/>
             <w:webHidden/>
           </w:rPr>
-          <w:instrText xml:space="preserve"> PAGEREF _Toc243987336 \h </w:instrText>
+          <w:instrText xml:space="preserve"> PAGEREF _Toc243990064 \h </w:instrText>
         </w:r>
         <w:r>
           <w:rPr>
@@ -4759,7 +4759,7 @@
           <w14:ligatures w14:val="standardContextual"/>
         </w:rPr>
       </w:pPr>
-      <w:hyperlink w:anchor="_Toc243987337" w:history="1">
+      <w:hyperlink w:anchor="_Toc243990065" w:history="1">
         <w:r>
           <w:rPr>
             <w:rStyle w:val="aff8"/>
@@ -4786,7 +4786,7 @@
             <w:noProof/>
             <w:webHidden/>
           </w:rPr>
-          <w:instrText xml:space="preserve"> PAGEREF _Toc243987337 \h </w:instrText>
+          <w:instrText xml:space="preserve"> PAGEREF _Toc243990065 \h </w:instrText>
         </w:r>
         <w:r>
           <w:rPr>
@@ -4832,7 +4832,7 @@
           <w14:ligatures w14:val="standardContextual"/>
         </w:rPr>
       </w:pPr>
-      <w:hyperlink w:anchor="_Toc243987338" w:history="1">
+      <w:hyperlink w:anchor="_Toc243990066" w:history="1">
         <w:r>
           <w:rPr>
             <w:rStyle w:val="aff8"/>
@@ -4859,7 +4859,7 @@
             <w:noProof/>
             <w:webHidden/>
           </w:rPr>
-          <w:instrText xml:space="preserve"> PAGEREF _Toc243987338 \h </w:instrText>
+          <w:instrText xml:space="preserve"> PAGEREF _Toc243990066 \h </w:instrText>
         </w:r>
         <w:r>
           <w:rPr>
@@ -4905,7 +4905,7 @@
           <w14:ligatures w14:val="standardContextual"/>
         </w:rPr>
       </w:pPr>
-      <w:hyperlink w:anchor="_Toc243987339" w:history="1">
+      <w:hyperlink w:anchor="_Toc243990067" w:history="1">
         <w:r>
           <w:rPr>
             <w:rStyle w:val="aff8"/>
@@ -4932,7 +4932,7 @@
             <w:noProof/>
             <w:webHidden/>
           </w:rPr>
-          <w:instrText xml:space="preserve"> PAGEREF _Toc243987339 \h </w:instrText>
+          <w:instrText xml:space="preserve"> PAGEREF _Toc243990067 \h </w:instrText>
         </w:r>
         <w:r>
           <w:rPr>
@@ -4978,7 +4978,7 @@
           <w14:ligatures w14:val="standardContextual"/>
         </w:rPr>
       </w:pPr>
-      <w:hyperlink w:anchor="_Toc243987340" w:history="1">
+      <w:hyperlink w:anchor="_Toc243990068" w:history="1">
         <w:r>
           <w:rPr>
             <w:rStyle w:val="aff8"/>
@@ -5005,7 +5005,7 @@
             <w:noProof/>
             <w:webHidden/>
           </w:rPr>
-          <w:instrText xml:space="preserve"> PAGEREF _Toc243987340 \h </w:instrText>
+          <w:instrText xml:space="preserve"> PAGEREF _Toc243990068 \h </w:instrText>
         </w:r>
         <w:r>
           <w:rPr>
@@ -5051,7 +5051,7 @@
           <w14:ligatures w14:val="standardContextual"/>
         </w:rPr>
       </w:pPr>
-      <w:hyperlink w:anchor="_Toc243987341" w:history="1">
+      <w:hyperlink w:anchor="_Toc243990069" w:history="1">
         <w:r>
           <w:rPr>
             <w:rStyle w:val="aff8"/>
@@ -5078,7 +5078,7 @@
             <w:noProof/>
             <w:webHidden/>
           </w:rPr>
-          <w:instrText xml:space="preserve"> PAGEREF _Toc243987341 \h </w:instrText>
+          <w:instrText xml:space="preserve"> PAGEREF _Toc243990069 \h </w:instrText>
         </w:r>
         <w:r>
           <w:rPr>
@@ -5124,7 +5124,7 @@
           <w14:ligatures w14:val="standardContextual"/>
         </w:rPr>
       </w:pPr>
-      <w:hyperlink w:anchor="_Toc243987342" w:history="1">
+      <w:hyperlink w:anchor="_Toc243990070" w:history="1">
         <w:r>
           <w:rPr>
             <w:rStyle w:val="aff8"/>
@@ -5151,7 +5151,7 @@
             <w:noProof/>
             <w:webHidden/>
           </w:rPr>
-          <w:instrText xml:space="preserve"> PAGEREF _Toc243987342 \h </w:instrText>
+          <w:instrText xml:space="preserve"> PAGEREF _Toc243990070 \h </w:instrText>
         </w:r>
         <w:r>
           <w:rPr>
@@ -5197,7 +5197,7 @@
           <w14:ligatures w14:val="standardContextual"/>
         </w:rPr>
       </w:pPr>
-      <w:hyperlink w:anchor="_Toc243987343" w:history="1">
+      <w:hyperlink w:anchor="_Toc243990071" w:history="1">
         <w:r>
           <w:rPr>
             <w:rStyle w:val="aff8"/>
@@ -5224,7 +5224,7 @@
             <w:noProof/>
             <w:webHidden/>
           </w:rPr>
-          <w:instrText xml:space="preserve"> PAGEREF _Toc243987343 \h </w:instrText>
+          <w:instrText xml:space="preserve"> PAGEREF _Toc243990071 \h </w:instrText>
         </w:r>
         <w:r>
           <w:rPr>
@@ -5270,7 +5270,7 @@
           <w14:ligatures w14:val="standardContextual"/>
         </w:rPr>
       </w:pPr>
-      <w:hyperlink w:anchor="_Toc243987344" w:history="1">
+      <w:hyperlink w:anchor="_Toc243990072" w:history="1">
         <w:r>
           <w:rPr>
             <w:rStyle w:val="aff8"/>
@@ -5297,7 +5297,7 @@
             <w:noProof/>
             <w:webHidden/>
           </w:rPr>
-          <w:instrText xml:space="preserve"> PAGEREF _Toc243987344 \h </w:instrText>
+          <w:instrText xml:space="preserve"> PAGEREF _Toc243990072 \h </w:instrText>
         </w:r>
         <w:r>
           <w:rPr>
@@ -5343,7 +5343,7 @@
           <w14:ligatures w14:val="standardContextual"/>
         </w:rPr>
       </w:pPr>
-      <w:hyperlink w:anchor="_Toc243987345" w:history="1">
+      <w:hyperlink w:anchor="_Toc243990073" w:history="1">
         <w:r>
           <w:rPr>
             <w:rStyle w:val="aff8"/>
@@ -5370,7 +5370,7 @@
             <w:noProof/>
             <w:webHidden/>
           </w:rPr>
-          <w:instrText xml:space="preserve"> PAGEREF _Toc243987345 \h </w:instrText>
+          <w:instrText xml:space="preserve"> PAGEREF _Toc243990073 \h </w:instrText>
         </w:r>
         <w:r>
           <w:rPr>
@@ -5416,7 +5416,7 @@
           <w14:ligatures w14:val="standardContextual"/>
         </w:rPr>
       </w:pPr>
-      <w:hyperlink w:anchor="_Toc243987346" w:history="1">
+      <w:hyperlink w:anchor="_Toc243990074" w:history="1">
         <w:r>
           <w:rPr>
             <w:rStyle w:val="aff8"/>
@@ -5443,7 +5443,7 @@
             <w:noProof/>
             <w:webHidden/>
           </w:rPr>
-          <w:instrText xml:space="preserve"> PAGEREF _Toc243987346 \h </w:instrText>
+          <w:instrText xml:space="preserve"> PAGEREF _Toc243990074 \h </w:instrText>
         </w:r>
         <w:r>
           <w:rPr>
@@ -5489,7 +5489,7 @@
         <w:ind w:firstLine="0"/>
         <w:jc w:val="center"/>
       </w:pPr>
-      <w:bookmarkStart w:id="0" w:name="_Toc243987276"/>
+      <w:bookmarkStart w:id="0" w:name="_Toc243990004"/>
       <w:r>
         <w:lastRenderedPageBreak/>
         <w:t>ПЕРЕЧЕНЬ ТЕРМИНОВ И СОКРАЩЕНИЙ</w:t>
@@ -6751,7 +6751,7 @@
         <w:pStyle w:val="1"/>
         <w:pageBreakBefore/>
       </w:pPr>
-      <w:bookmarkStart w:id="1" w:name="_Toc243987277"/>
+      <w:bookmarkStart w:id="1" w:name="_Toc243990005"/>
       <w:r>
         <w:lastRenderedPageBreak/>
         <w:t>1 Исходные положения</w:t>
@@ -6762,7 +6762,7 @@
       <w:pPr>
         <w:pStyle w:val="21"/>
       </w:pPr>
-      <w:bookmarkStart w:id="2" w:name="_Toc243987278"/>
+      <w:bookmarkStart w:id="2" w:name="_Toc243990006"/>
       <w:r>
         <w:t>1.1 Назначение документа</w:t>
       </w:r>
@@ -6777,7 +6777,7 @@
       <w:pPr>
         <w:pStyle w:val="21"/>
       </w:pPr>
-      <w:bookmarkStart w:id="3" w:name="_Toc243987279"/>
+      <w:bookmarkStart w:id="3" w:name="_Toc243990007"/>
       <w:r>
         <w:t>1.2 Сведения об объекте автоматизации</w:t>
       </w:r>
@@ -6792,7 +6792,7 @@
       <w:pPr>
         <w:pStyle w:val="21"/>
       </w:pPr>
-      <w:bookmarkStart w:id="4" w:name="_Toc243987280"/>
+      <w:bookmarkStart w:id="4" w:name="_Toc243990008"/>
       <w:r>
         <w:t>1.3 Категории пользователей</w:t>
       </w:r>
@@ -7293,7 +7293,7 @@
         <w:pStyle w:val="1"/>
         <w:pageBreakBefore/>
       </w:pPr>
-      <w:bookmarkStart w:id="5" w:name="_Toc243987281"/>
+      <w:bookmarkStart w:id="5" w:name="_Toc243990009"/>
       <w:r>
         <w:lastRenderedPageBreak/>
         <w:t>2 Цели автоматизированной системы и автоматизированные функции</w:t>
@@ -7599,7 +7599,7 @@
         <w:pStyle w:val="1"/>
         <w:pageBreakBefore/>
       </w:pPr>
-      <w:bookmarkStart w:id="6" w:name="_Toc243987282"/>
+      <w:bookmarkStart w:id="6" w:name="_Toc243990010"/>
       <w:r>
         <w:lastRenderedPageBreak/>
         <w:t>3 Характеристика функциональной структуры</w:t>
@@ -7610,7 +7610,7 @@
       <w:pPr>
         <w:pStyle w:val="21"/>
       </w:pPr>
-      <w:bookmarkStart w:id="7" w:name="_Toc243987283"/>
+      <w:bookmarkStart w:id="7" w:name="_Toc243990011"/>
       <w:r>
         <w:t>3.1 Перечень подсистем и функций</w:t>
       </w:r>
@@ -9905,7 +9905,7 @@
       <w:pPr>
         <w:pStyle w:val="21"/>
       </w:pPr>
-      <w:bookmarkStart w:id="8" w:name="_Toc243987284"/>
+      <w:bookmarkStart w:id="8" w:name="_Toc243990012"/>
       <w:r>
         <w:lastRenderedPageBreak/>
         <w:t>3.2 Последовательность выполнения функций</w:t>
@@ -9976,7 +9976,7 @@
       <w:pPr>
         <w:pStyle w:val="21"/>
       </w:pPr>
-      <w:bookmarkStart w:id="9" w:name="_Toc243987285"/>
+      <w:bookmarkStart w:id="9" w:name="_Toc243990013"/>
       <w:r>
         <w:t>3.3 Сквозные правила</w:t>
       </w:r>
@@ -10022,7 +10022,7 @@
         <w:pStyle w:val="1"/>
         <w:pageBreakBefore/>
       </w:pPr>
-      <w:bookmarkStart w:id="10" w:name="_Toc243987286"/>
+      <w:bookmarkStart w:id="10" w:name="_Toc243990014"/>
       <w:r>
         <w:lastRenderedPageBreak/>
         <w:t>4 Подсистема «Организационная структура и права доступа»</w:t>
@@ -10033,7 +10033,7 @@
       <w:pPr>
         <w:pStyle w:val="21"/>
       </w:pPr>
-      <w:bookmarkStart w:id="11" w:name="_Toc243987287"/>
+      <w:bookmarkStart w:id="11" w:name="_Toc243990015"/>
       <w:r>
         <w:t>4.1 ОРГ-01 Вход в систему и выход</w:t>
       </w:r>
@@ -10123,7 +10123,7 @@
       <w:pPr>
         <w:pStyle w:val="21"/>
       </w:pPr>
-      <w:bookmarkStart w:id="12" w:name="_Toc243987288"/>
+      <w:bookmarkStart w:id="12" w:name="_Toc243990016"/>
       <w:r>
         <w:t>4.2 ОРГ-02 Восстановление и смена пароля</w:t>
       </w:r>
@@ -10194,7 +10194,7 @@
       <w:pPr>
         <w:pStyle w:val="21"/>
       </w:pPr>
-      <w:bookmarkStart w:id="13" w:name="_Toc243987289"/>
+      <w:bookmarkStart w:id="13" w:name="_Toc243990017"/>
       <w:r>
         <w:t>4.3 ОРГ-03 Ведение компаний</w:t>
       </w:r>
@@ -10224,7 +10224,7 @@
       <w:pPr>
         <w:pStyle w:val="21"/>
       </w:pPr>
-      <w:bookmarkStart w:id="14" w:name="_Toc243987290"/>
+      <w:bookmarkStart w:id="14" w:name="_Toc243990018"/>
       <w:r>
         <w:t>4.4 ОРГ-04 Ведение отделов</w:t>
       </w:r>
@@ -10254,7 +10254,7 @@
       <w:pPr>
         <w:pStyle w:val="21"/>
       </w:pPr>
-      <w:bookmarkStart w:id="15" w:name="_Toc243987291"/>
+      <w:bookmarkStart w:id="15" w:name="_Toc243990019"/>
       <w:r>
         <w:t>4.5 ОРГ-05 Ведение пользователей</w:t>
       </w:r>
@@ -10315,7 +10315,7 @@
       <w:pPr>
         <w:pStyle w:val="21"/>
       </w:pPr>
-      <w:bookmarkStart w:id="16" w:name="_Toc243987292"/>
+      <w:bookmarkStart w:id="16" w:name="_Toc243990020"/>
       <w:r>
         <w:t>4.6 ОРГ-06 Ведение ролей и разрешений</w:t>
       </w:r>
@@ -10370,7 +10370,7 @@
       <w:pPr>
         <w:pStyle w:val="21"/>
       </w:pPr>
-      <w:bookmarkStart w:id="17" w:name="_Toc243987293"/>
+      <w:bookmarkStart w:id="17" w:name="_Toc243990021"/>
       <w:r>
         <w:t>4.7 ОРГ-07 Разграничение доступа к данным</w:t>
       </w:r>
@@ -10458,7 +10458,7 @@
       <w:pPr>
         <w:pStyle w:val="21"/>
       </w:pPr>
-      <w:bookmarkStart w:id="18" w:name="_Toc243987294"/>
+      <w:bookmarkStart w:id="18" w:name="_Toc243990022"/>
       <w:r>
         <w:t>4.8 ОРГ-08 Журнал изменений прав доступа</w:t>
       </w:r>
@@ -10479,7 +10479,7 @@
         <w:pStyle w:val="1"/>
         <w:pageBreakBefore/>
       </w:pPr>
-      <w:bookmarkStart w:id="19" w:name="_Toc243987295"/>
+      <w:bookmarkStart w:id="19" w:name="_Toc243990023"/>
       <w:r>
         <w:lastRenderedPageBreak/>
         <w:t>5 Подсистема «Каталог недвижимости»</w:t>
@@ -10490,7 +10490,7 @@
       <w:pPr>
         <w:pStyle w:val="21"/>
       </w:pPr>
-      <w:bookmarkStart w:id="20" w:name="_Toc243987296"/>
+      <w:bookmarkStart w:id="20" w:name="_Toc243990024"/>
       <w:r>
         <w:t>5.1 КАТ-01 Ведение проектов</w:t>
       </w:r>
@@ -10520,7 +10520,7 @@
       <w:pPr>
         <w:pStyle w:val="21"/>
       </w:pPr>
-      <w:bookmarkStart w:id="21" w:name="_Toc243987297"/>
+      <w:bookmarkStart w:id="21" w:name="_Toc243990025"/>
       <w:r>
         <w:t>5.2 КАТ-02 Ведение домов</w:t>
       </w:r>
@@ -10550,7 +10550,7 @@
       <w:pPr>
         <w:pStyle w:val="21"/>
       </w:pPr>
-      <w:bookmarkStart w:id="22" w:name="_Toc243987298"/>
+      <w:bookmarkStart w:id="22" w:name="_Toc243990026"/>
       <w:r>
         <w:t>5.3 КАТ-03 Загрузка объектов из шаблона</w:t>
       </w:r>
@@ -10611,7 +10611,7 @@
       <w:pPr>
         <w:pStyle w:val="21"/>
       </w:pPr>
-      <w:bookmarkStart w:id="23" w:name="_Toc243987299"/>
+      <w:bookmarkStart w:id="23" w:name="_Toc243990027"/>
       <w:r>
         <w:t>5.4 КАТ-04 Шахматка и карточка объекта</w:t>
       </w:r>
@@ -11047,7 +11047,7 @@
       <w:pPr>
         <w:pStyle w:val="21"/>
       </w:pPr>
-      <w:bookmarkStart w:id="24" w:name="_Toc243987300"/>
+      <w:bookmarkStart w:id="24" w:name="_Toc243990028"/>
       <w:r>
         <w:t>5.5 КАТ-05 Вывод объекта из продажи (резерв)</w:t>
       </w:r>
@@ -11092,7 +11092,7 @@
       <w:pPr>
         <w:pStyle w:val="21"/>
       </w:pPr>
-      <w:bookmarkStart w:id="25" w:name="_Toc243987301"/>
+      <w:bookmarkStart w:id="25" w:name="_Toc243990029"/>
       <w:r>
         <w:t>5.6 КАТ-06 Ведение планировок</w:t>
       </w:r>
@@ -11132,7 +11132,7 @@
       <w:pPr>
         <w:pStyle w:val="21"/>
       </w:pPr>
-      <w:bookmarkStart w:id="26" w:name="_Toc243987302"/>
+      <w:bookmarkStart w:id="26" w:name="_Toc243990030"/>
       <w:r>
         <w:t>5.7 КАТ-07 Ведение галерей</w:t>
       </w:r>
@@ -11158,7 +11158,7 @@
       <w:pPr>
         <w:pStyle w:val="21"/>
       </w:pPr>
-      <w:bookmarkStart w:id="27" w:name="_Toc243987303"/>
+      <w:bookmarkStart w:id="27" w:name="_Toc243990031"/>
       <w:r>
         <w:t>5.8 КАТ-08 Ведение скидок</w:t>
       </w:r>
@@ -11214,7 +11214,7 @@
         <w:pStyle w:val="1"/>
         <w:pageBreakBefore/>
       </w:pPr>
-      <w:bookmarkStart w:id="28" w:name="_Toc243987304"/>
+      <w:bookmarkStart w:id="28" w:name="_Toc243990032"/>
       <w:r>
         <w:lastRenderedPageBreak/>
         <w:t>6 Подсистема «Работа с клиентами»</w:t>
@@ -11225,7 +11225,7 @@
       <w:pPr>
         <w:pStyle w:val="21"/>
       </w:pPr>
-      <w:bookmarkStart w:id="29" w:name="_Toc243987305"/>
+      <w:bookmarkStart w:id="29" w:name="_Toc243990033"/>
       <w:r>
         <w:t>6.1 КЛИ-01 Ведение клиентов</w:t>
       </w:r>
@@ -11295,7 +11295,7 @@
       <w:pPr>
         <w:pStyle w:val="21"/>
       </w:pPr>
-      <w:bookmarkStart w:id="30" w:name="_Toc243987306"/>
+      <w:bookmarkStart w:id="30" w:name="_Toc243990034"/>
       <w:r>
         <w:t>6.2 КЛИ-02 Ведение заявок</w:t>
       </w:r>
@@ -11351,7 +11351,7 @@
       <w:pPr>
         <w:pStyle w:val="21"/>
       </w:pPr>
-      <w:bookmarkStart w:id="31" w:name="_Toc243987307"/>
+      <w:bookmarkStart w:id="31" w:name="_Toc243990035"/>
       <w:r>
         <w:t>6.3 КЛИ-03 Канбан-доска заявок</w:t>
       </w:r>
@@ -11376,7 +11376,7 @@
       <w:pPr>
         <w:pStyle w:val="21"/>
       </w:pPr>
-      <w:bookmarkStart w:id="32" w:name="_Toc243987308"/>
+      <w:bookmarkStart w:id="32" w:name="_Toc243990036"/>
       <w:r>
         <w:t>6.4 КЛИ-04 Ведение встреч</w:t>
       </w:r>
@@ -11431,7 +11431,7 @@
       <w:pPr>
         <w:pStyle w:val="21"/>
       </w:pPr>
-      <w:bookmarkStart w:id="33" w:name="_Toc243987309"/>
+      <w:bookmarkStart w:id="33" w:name="_Toc243990037"/>
       <w:r>
         <w:lastRenderedPageBreak/>
         <w:t>6.5 КЛИ-05 Ведение справочников заявок</w:t>
@@ -11458,7 +11458,7 @@
         <w:pStyle w:val="1"/>
         <w:pageBreakBefore/>
       </w:pPr>
-      <w:bookmarkStart w:id="34" w:name="_Toc243987310"/>
+      <w:bookmarkStart w:id="34" w:name="_Toc243990038"/>
       <w:r>
         <w:lastRenderedPageBreak/>
         <w:t>7 Подсистема «Сделки»</w:t>
@@ -11469,7 +11469,7 @@
       <w:pPr>
         <w:pStyle w:val="21"/>
       </w:pPr>
-      <w:bookmarkStart w:id="35" w:name="_Toc243987311"/>
+      <w:bookmarkStart w:id="35" w:name="_Toc243990039"/>
       <w:r>
         <w:t>7.1 СДЕ-01 Создание брони</w:t>
       </w:r>
@@ -11529,7 +11529,7 @@
       <w:pPr>
         <w:pStyle w:val="21"/>
       </w:pPr>
-      <w:bookmarkStart w:id="36" w:name="_Toc243987312"/>
+      <w:bookmarkStart w:id="36" w:name="_Toc243990040"/>
       <w:r>
         <w:t>7.2 СДЕ-02 Условия сделки и применение скидок</w:t>
       </w:r>
@@ -11600,7 +11600,7 @@
       <w:pPr>
         <w:pStyle w:val="21"/>
       </w:pPr>
-      <w:bookmarkStart w:id="37" w:name="_Toc243987313"/>
+      <w:bookmarkStart w:id="37" w:name="_Toc243990041"/>
       <w:r>
         <w:t>7.3 СДЕ-03 Реквизиты договора и закрытие сделки</w:t>
       </w:r>
@@ -11659,7 +11659,7 @@
       <w:pPr>
         <w:pStyle w:val="21"/>
       </w:pPr>
-      <w:bookmarkStart w:id="38" w:name="_Toc243987314"/>
+      <w:bookmarkStart w:id="38" w:name="_Toc243990042"/>
       <w:r>
         <w:t>7.4 СДЕ-04 Отмена и расторжение сделки</w:t>
       </w:r>
@@ -11740,7 +11740,7 @@
         <w:pStyle w:val="1"/>
         <w:pageBreakBefore/>
       </w:pPr>
-      <w:bookmarkStart w:id="39" w:name="_Toc243987315"/>
+      <w:bookmarkStart w:id="39" w:name="_Toc243990043"/>
       <w:r>
         <w:lastRenderedPageBreak/>
         <w:t>8 Подсистема «Финансы»</w:t>
@@ -11751,7 +11751,7 @@
       <w:pPr>
         <w:pStyle w:val="21"/>
       </w:pPr>
-      <w:bookmarkStart w:id="40" w:name="_Toc243987316"/>
+      <w:bookmarkStart w:id="40" w:name="_Toc243990044"/>
       <w:r>
         <w:t>8.1 ФИН-01 Ведение графика платежей</w:t>
       </w:r>
@@ -11831,7 +11831,7 @@
       <w:pPr>
         <w:pStyle w:val="21"/>
       </w:pPr>
-      <w:bookmarkStart w:id="41" w:name="_Toc243987317"/>
+      <w:bookmarkStart w:id="41" w:name="_Toc243990045"/>
       <w:r>
         <w:lastRenderedPageBreak/>
         <w:t>8.2 ФИН-02 Отметка оплаты</w:t>
@@ -11887,7 +11887,7 @@
       <w:pPr>
         <w:pStyle w:val="21"/>
       </w:pPr>
-      <w:bookmarkStart w:id="42" w:name="_Toc243987318"/>
+      <w:bookmarkStart w:id="42" w:name="_Toc243990046"/>
       <w:r>
         <w:t>8.3 ФИН-03 Учёт просрочки</w:t>
       </w:r>
@@ -11907,7 +11907,7 @@
       <w:pPr>
         <w:pStyle w:val="21"/>
       </w:pPr>
-      <w:bookmarkStart w:id="43" w:name="_Toc243987319"/>
+      <w:bookmarkStart w:id="43" w:name="_Toc243990047"/>
       <w:r>
         <w:t>8.4 ФИН-04 Учёт возвратов</w:t>
       </w:r>
@@ -11937,7 +11937,7 @@
       <w:pPr>
         <w:pStyle w:val="21"/>
       </w:pPr>
-      <w:bookmarkStart w:id="44" w:name="_Toc243987320"/>
+      <w:bookmarkStart w:id="44" w:name="_Toc243990048"/>
       <w:r>
         <w:t>8.5 ФИН-05 Список и сводная таблица платежей</w:t>
       </w:r>
@@ -11968,7 +11968,7 @@
       <w:pPr>
         <w:pStyle w:val="21"/>
       </w:pPr>
-      <w:bookmarkStart w:id="45" w:name="_Toc243987321"/>
+      <w:bookmarkStart w:id="45" w:name="_Toc243990049"/>
       <w:r>
         <w:t>8.6 ФИН-06 Ведение финансовых справочников</w:t>
       </w:r>
@@ -12018,7 +12018,7 @@
       <w:pPr>
         <w:pStyle w:val="21"/>
       </w:pPr>
-      <w:bookmarkStart w:id="46" w:name="_Toc243987322"/>
+      <w:bookmarkStart w:id="46" w:name="_Toc243990050"/>
       <w:r>
         <w:t>8.7 ФИН-07 Валюты и курсы</w:t>
       </w:r>
@@ -12082,7 +12082,7 @@
       <w:pPr>
         <w:pStyle w:val="21"/>
       </w:pPr>
-      <w:bookmarkStart w:id="47" w:name="_Toc243987323"/>
+      <w:bookmarkStart w:id="47" w:name="_Toc243990051"/>
       <w:r>
         <w:t>8.8 ФИН-08 Планы оплаты и варианты оплаты</w:t>
       </w:r>
@@ -12156,7 +12156,7 @@
         <w:pStyle w:val="1"/>
         <w:pageBreakBefore/>
       </w:pPr>
-      <w:bookmarkStart w:id="48" w:name="_Toc243987324"/>
+      <w:bookmarkStart w:id="48" w:name="_Toc243990052"/>
       <w:r>
         <w:lastRenderedPageBreak/>
         <w:t>9 Подсистема «Шаблоны документов»</w:t>
@@ -12167,7 +12167,7 @@
       <w:pPr>
         <w:pStyle w:val="21"/>
       </w:pPr>
-      <w:bookmarkStart w:id="49" w:name="_Toc243987325"/>
+      <w:bookmarkStart w:id="49" w:name="_Toc243990053"/>
       <w:r>
         <w:t>9.1 ДОК-01 Ведение шаблонов документов</w:t>
       </w:r>
@@ -12207,7 +12207,7 @@
       <w:pPr>
         <w:pStyle w:val="21"/>
       </w:pPr>
-      <w:bookmarkStart w:id="50" w:name="_Toc243987326"/>
+      <w:bookmarkStart w:id="50" w:name="_Toc243990054"/>
       <w:r>
         <w:t>9.2 ДОК-02 Формирование документа по сделке</w:t>
       </w:r>
@@ -12258,7 +12258,7 @@
         <w:pStyle w:val="1"/>
         <w:pageBreakBefore/>
       </w:pPr>
-      <w:bookmarkStart w:id="51" w:name="_Toc243987327"/>
+      <w:bookmarkStart w:id="51" w:name="_Toc243990055"/>
       <w:r>
         <w:lastRenderedPageBreak/>
         <w:t>10 Подсистема «Задачи»</w:t>
@@ -12269,7 +12269,7 @@
       <w:pPr>
         <w:pStyle w:val="21"/>
       </w:pPr>
-      <w:bookmarkStart w:id="52" w:name="_Toc243987328"/>
+      <w:bookmarkStart w:id="52" w:name="_Toc243990056"/>
       <w:r>
         <w:t>10.1 ЗАД-01 Постановка задачи</w:t>
       </w:r>
@@ -12299,7 +12299,7 @@
       <w:pPr>
         <w:pStyle w:val="21"/>
       </w:pPr>
-      <w:bookmarkStart w:id="53" w:name="_Toc243987329"/>
+      <w:bookmarkStart w:id="53" w:name="_Toc243990057"/>
       <w:r>
         <w:t>10.2 ЗАД-02 Исполнение и контроль задачи</w:t>
       </w:r>
@@ -12344,7 +12344,7 @@
       <w:pPr>
         <w:pStyle w:val="21"/>
       </w:pPr>
-      <w:bookmarkStart w:id="54" w:name="_Toc243987330"/>
+      <w:bookmarkStart w:id="54" w:name="_Toc243990058"/>
       <w:r>
         <w:t>10.3 ЗАД-03 Представления задач</w:t>
       </w:r>
@@ -12360,7 +12360,7 @@
         <w:pStyle w:val="1"/>
         <w:pageBreakBefore/>
       </w:pPr>
-      <w:bookmarkStart w:id="55" w:name="_Toc243987331"/>
+      <w:bookmarkStart w:id="55" w:name="_Toc243990059"/>
       <w:r>
         <w:lastRenderedPageBreak/>
         <w:t>11 Подсистема «Аналитика и отчётность»</w:t>
@@ -12371,7 +12371,7 @@
       <w:pPr>
         <w:pStyle w:val="21"/>
       </w:pPr>
-      <w:bookmarkStart w:id="56" w:name="_Toc243987332"/>
+      <w:bookmarkStart w:id="56" w:name="_Toc243990060"/>
       <w:r>
         <w:t>11.1 АНА-01 Дашборд</w:t>
       </w:r>
@@ -12396,7 +12396,7 @@
       <w:pPr>
         <w:pStyle w:val="21"/>
       </w:pPr>
-      <w:bookmarkStart w:id="57" w:name="_Toc243987333"/>
+      <w:bookmarkStart w:id="57" w:name="_Toc243990061"/>
       <w:r>
         <w:t>11.2 АНА-02 Сводные таблицы</w:t>
       </w:r>
@@ -12424,7 +12424,7 @@
     </w:p>
     <w:p>
       <w:r>
-        <w:t>– сделки — группировка по менеджеру, проекту, статусу;</w:t>
+        <w:t>– сделки — группировка по менеджеру, проекту, статусу; по каждой группе число сделок в статусах «Бронь», «В работе», «Успешно закрыта», «Расторгнута», «Отменена» и «Итого» — все, кроме отменённых; заголовки выгрузки в Excel — на языке интерфейса;</w:t>
       </w:r>
     </w:p>
     <w:p>
@@ -12441,7 +12441,7 @@
       <w:pPr>
         <w:pStyle w:val="21"/>
       </w:pPr>
-      <w:bookmarkStart w:id="58" w:name="_Toc243987334"/>
+      <w:bookmarkStart w:id="58" w:name="_Toc243990062"/>
       <w:r>
         <w:t>11.3 АНА-03 Планы продаж</w:t>
       </w:r>
@@ -12454,12 +12454,12 @@
     </w:p>
     <w:p>
       <w:r>
+        <w:lastRenderedPageBreak/>
         <w:t>Входная информация: файл XLSX по шаблону — план по проектам или план по сотрудникам.</w:t>
       </w:r>
     </w:p>
     <w:p>
       <w:r>
-        <w:lastRenderedPageBreak/>
         <w:t>Правила: повторная загрузка перезаписывает план за тот же период; планы по проектам и по сотрудникам независимы; сотрудниками считаются пользователи с действующим профилем.</w:t>
       </w:r>
     </w:p>
@@ -12467,7 +12467,7 @@
       <w:pPr>
         <w:pStyle w:val="21"/>
       </w:pPr>
-      <w:bookmarkStart w:id="59" w:name="_Toc243987335"/>
+      <w:bookmarkStart w:id="59" w:name="_Toc243990063"/>
       <w:r>
         <w:t>11.4 АНА-04 Отчёты «план-факт»</w:t>
       </w:r>
@@ -12521,7 +12521,7 @@
         <w:pStyle w:val="1"/>
         <w:pageBreakBefore/>
       </w:pPr>
-      <w:bookmarkStart w:id="60" w:name="_Toc243987336"/>
+      <w:bookmarkStart w:id="60" w:name="_Toc243990064"/>
       <w:r>
         <w:lastRenderedPageBreak/>
         <w:t>12 Подсистема «Интеграция с партнёрами»</w:t>
@@ -12532,7 +12532,7 @@
       <w:pPr>
         <w:pStyle w:val="21"/>
       </w:pPr>
-      <w:bookmarkStart w:id="61" w:name="_Toc243987337"/>
+      <w:bookmarkStart w:id="61" w:name="_Toc243990065"/>
       <w:r>
         <w:t>12.1 ИНТ-01 Выдача сведений партнёрам</w:t>
       </w:r>
@@ -12602,7 +12602,7 @@
       <w:pPr>
         <w:pStyle w:val="21"/>
       </w:pPr>
-      <w:bookmarkStart w:id="62" w:name="_Toc243987338"/>
+      <w:bookmarkStart w:id="62" w:name="_Toc243990066"/>
       <w:r>
         <w:t>12.2 ИНТ-02 Приём заявок от партнёров</w:t>
       </w:r>
@@ -12642,7 +12642,7 @@
       <w:pPr>
         <w:pStyle w:val="21"/>
       </w:pPr>
-      <w:bookmarkStart w:id="63" w:name="_Toc243987339"/>
+      <w:bookmarkStart w:id="63" w:name="_Toc243990067"/>
       <w:r>
         <w:t>12.3 ИНТ-03 Управление API-ключами</w:t>
       </w:r>
@@ -12674,7 +12674,7 @@
         <w:pStyle w:val="1"/>
         <w:pageBreakBefore/>
       </w:pPr>
-      <w:bookmarkStart w:id="64" w:name="_Toc243987340"/>
+      <w:bookmarkStart w:id="64" w:name="_Toc243990068"/>
       <w:r>
         <w:lastRenderedPageBreak/>
         <w:t>13 Подсистема «Регламентные задания»</w:t>
@@ -12685,7 +12685,7 @@
       <w:pPr>
         <w:pStyle w:val="21"/>
       </w:pPr>
-      <w:bookmarkStart w:id="65" w:name="_Toc243987341"/>
+      <w:bookmarkStart w:id="65" w:name="_Toc243990069"/>
       <w:r>
         <w:t>13.1 РЕГ-01 Пересчёт просрочки платежей</w:t>
       </w:r>
@@ -12710,7 +12710,7 @@
       <w:pPr>
         <w:pStyle w:val="21"/>
       </w:pPr>
-      <w:bookmarkStart w:id="66" w:name="_Toc243987342"/>
+      <w:bookmarkStart w:id="66" w:name="_Toc243990070"/>
       <w:r>
         <w:t>13.2 РЕГ-02 Снятие истёкших броней</w:t>
       </w:r>
@@ -12735,7 +12735,7 @@
       <w:pPr>
         <w:pStyle w:val="21"/>
       </w:pPr>
-      <w:bookmarkStart w:id="67" w:name="_Toc243987343"/>
+      <w:bookmarkStart w:id="67" w:name="_Toc243990071"/>
       <w:r>
         <w:t>13.3 РЕГ-03 Закрытие забытых встреч</w:t>
       </w:r>
@@ -12760,7 +12760,7 @@
       <w:pPr>
         <w:pStyle w:val="21"/>
       </w:pPr>
-      <w:bookmarkStart w:id="68" w:name="_Toc243987344"/>
+      <w:bookmarkStart w:id="68" w:name="_Toc243990072"/>
       <w:r>
         <w:t>13.4 РЕГ-04 Загрузка курсов валют</w:t>
       </w:r>
@@ -12796,7 +12796,7 @@
         <w:pStyle w:val="1"/>
         <w:pageBreakBefore/>
       </w:pPr>
-      <w:bookmarkStart w:id="69" w:name="_Toc243987345"/>
+      <w:bookmarkStart w:id="69" w:name="_Toc243990073"/>
       <w:r>
         <w:lastRenderedPageBreak/>
         <w:t>14 Типовые решения</w:t>
@@ -12815,7 +12815,7 @@
         <w:ind w:firstLine="0"/>
         <w:jc w:val="center"/>
       </w:pPr>
-      <w:bookmarkStart w:id="70" w:name="_Toc243987346"/>
+      <w:bookmarkStart w:id="70" w:name="_Toc243990074"/>
       <w:r>
         <w:lastRenderedPageBreak/>
         <w:t>ЛИСТ РЕГИСТРАЦИИ ИЗМЕНЕНИЙ</w:t>
@@ -14877,31 +14877,31 @@
       </w:rPr>
     </w:lvl>
   </w:abstractNum>
-  <w:num w:numId="1" w16cid:durableId="1596206483">
+  <w:num w:numId="1" w16cid:durableId="1978795141">
     <w:abstractNumId w:val="8"/>
   </w:num>
-  <w:num w:numId="2" w16cid:durableId="1861164813">
+  <w:num w:numId="2" w16cid:durableId="2080444561">
     <w:abstractNumId w:val="6"/>
   </w:num>
-  <w:num w:numId="3" w16cid:durableId="1590307993">
+  <w:num w:numId="3" w16cid:durableId="1217426842">
     <w:abstractNumId w:val="5"/>
   </w:num>
-  <w:num w:numId="4" w16cid:durableId="1018964721">
+  <w:num w:numId="4" w16cid:durableId="933320015">
     <w:abstractNumId w:val="4"/>
   </w:num>
-  <w:num w:numId="5" w16cid:durableId="1591111716">
+  <w:num w:numId="5" w16cid:durableId="1420829879">
     <w:abstractNumId w:val="7"/>
   </w:num>
-  <w:num w:numId="6" w16cid:durableId="1032458104">
+  <w:num w:numId="6" w16cid:durableId="500582775">
     <w:abstractNumId w:val="3"/>
   </w:num>
-  <w:num w:numId="7" w16cid:durableId="1719469294">
+  <w:num w:numId="7" w16cid:durableId="1903564723">
     <w:abstractNumId w:val="2"/>
   </w:num>
-  <w:num w:numId="8" w16cid:durableId="1853643373">
+  <w:num w:numId="8" w16cid:durableId="2106074929">
     <w:abstractNumId w:val="1"/>
   </w:num>
-  <w:num w:numId="9" w16cid:durableId="556941926">
+  <w:num w:numId="9" w16cid:durableId="639263633">
     <w:abstractNumId w:val="0"/>
   </w:num>
 </w:numbering>
@@ -26434,7 +26434,7 @@
     <w:autoRedefine/>
     <w:uiPriority w:val="39"/>
     <w:unhideWhenUsed/>
-    <w:rsid w:val="00CA4E01"/>
+    <w:rsid w:val="00AF25F0"/>
     <w:pPr>
       <w:spacing w:after="100"/>
     </w:pPr>
@@ -26446,7 +26446,7 @@
     <w:autoRedefine/>
     <w:uiPriority w:val="39"/>
     <w:unhideWhenUsed/>
-    <w:rsid w:val="00CA4E01"/>
+    <w:rsid w:val="00AF25F0"/>
     <w:pPr>
       <w:spacing w:after="100"/>
       <w:ind w:left="240"/>
@@ -26457,7 +26457,7 @@
     <w:basedOn w:val="a2"/>
     <w:uiPriority w:val="99"/>
     <w:unhideWhenUsed/>
-    <w:rsid w:val="00CA4E01"/>
+    <w:rsid w:val="00AF25F0"/>
     <w:rPr>
       <w:color w:val="0000FF" w:themeColor="hyperlink"/>
       <w:u w:val="single"/>

</xml_diff>